<commit_message>
BidDiff polish N3 hardening (pass 56): add sectPr to the redline OOXML
Red-teamed my own redline generator: the body lacked a final <w:sectPr>, which
makes some Word versions warn/render oddly. Added US-Letter section properties
(12240x15840 twips, 1" margins) + a test (present + last body child);
regenerated the sample. Maximizes the chance the human render-check (#9) passes
first try. Suite 418->419 green; typecheck + lint clean.

https://claude.ai/code/session_01SJV13TW9RsTHeE1MjJuNWQ
</commit_message>
<xml_diff>
--- a/products/biddiff/docs/store-assets/sample-redline.docx
+++ b/products/biddiff/docs/store-assets/sample-redline.docx
@@ -242,6 +242,10 @@
         <w:t xml:space="preserve">BidDiff identifies textual differences between solicitation documents to assist professional review. It does not provide legal, contracting, or capture advice. The original source documents remain the authoritative reference.</w:t>
       </w:r>
     </w:p>
+    <w:sectPr>
+      <w:pgSz w:w="12240" w:h="15840"/>
+      <w:pgMar w:top="1440" w:right="1440" w:bottom="1440" w:left="1440" w:header="720" w:footer="720" w:gutter="0"/>
+    </w:sectPr>
   </w:body>
 </w:document>
 </file>
</xml_diff>

<commit_message>
BidDiff polish N3 (pass 57, fix): correct redline rPr run-property schema order
Red-teaming my own redline generator found a real OOXML validity bug: CT_RPr is
sequence-ordered, but run-props were emitted in call order — headings gave
sz-before-b and insertions gave u-before-color, which Word rejects ("repair?"),
failing the human render-check. Emit in canonical order (b, strike, color, sz,
u) + a guard test scanning every rPr. Regenerated the sample. Suite 419->420
green; typecheck + lint clean.

https://claude.ai/code/session_01SJV13TW9RsTHeE1MjJuNWQ
</commit_message>
<xml_diff>
--- a/products/biddiff/docs/store-assets/sample-redline.docx
+++ b/products/biddiff/docs/store-assets/sample-redline.docx
@@ -5,8 +5,8 @@
     <w:p>
       <w:r>
         <w:rPr>
+          <w:b/>
           <w:sz w:val="28"/>
-          <w:b/>
         </w:rPr>
         <w:t xml:space="preserve">BidDiff — Solicitation Amendment Redline</w:t>
       </w:r>
@@ -29,8 +29,8 @@
     <w:p>
       <w:r>
         <w:rPr>
+          <w:b/>
           <w:sz w:val="28"/>
-          <w:b/>
         </w:rPr>
         <w:t xml:space="preserve">Critical changes</w:t>
       </w:r>
@@ -51,8 +51,8 @@
     <w:p>
       <w:r>
         <w:rPr>
-          <w:u w:val="single"/>
-          <w:color w:val="006100"/>
+          <w:color w:val="006100"/>
+          <w:u w:val="single"/>
         </w:rPr>
         <w:t xml:space="preserve">New: CLIN 0004 | Optional Tier 4 Escalation | 12 | Months</w:t>
       </w:r>
@@ -78,8 +78,8 @@
     <w:p>
       <w:r>
         <w:rPr>
-          <w:u w:val="single"/>
-          <w:color w:val="006100"/>
+          <w:color w:val="006100"/>
+          <w:u w:val="single"/>
         </w:rPr>
         <w:t xml:space="preserve">New: 52.204-25</w:t>
       </w:r>
@@ -110,8 +110,8 @@
     <w:p>
       <w:r>
         <w:rPr>
-          <w:u w:val="single"/>
-          <w:color w:val="006100"/>
+          <w:color w:val="006100"/>
+          <w:u w:val="single"/>
         </w:rPr>
         <w:t xml:space="preserve">New: Attachment 4: ITIL Compliance Statement</w:t>
       </w:r>
@@ -146,8 +146,8 @@
     <w:p>
       <w:r>
         <w:rPr>
-          <w:u w:val="single"/>
-          <w:color w:val="006100"/>
+          <w:color w:val="006100"/>
+          <w:u w:val="single"/>
         </w:rPr>
         <w:t xml:space="preserve">New: Offers are due no later than 2:00 PM Eastern Time on 2026-09-20.</w:t>
       </w:r>
@@ -182,8 +182,8 @@
     <w:p>
       <w:r>
         <w:rPr>
-          <w:u w:val="single"/>
-          <w:color w:val="006100"/>
+          <w:color w:val="006100"/>
+          <w:u w:val="single"/>
         </w:rPr>
         <w:t xml:space="preserve">New: The proposal shall not exceed 32 pages, single-sided, 12-point Times New Roman font, with one-inch margins.</w:t>
       </w:r>
@@ -218,8 +218,8 @@
     <w:p>
       <w:r>
         <w:rPr>
-          <w:u w:val="single"/>
-          <w:color w:val="006100"/>
+          <w:color w:val="006100"/>
+          <w:u w:val="single"/>
         </w:rPr>
         <w:t xml:space="preserve">New: Factor 1: Technical Approach with proven help-desk track record</w:t>
       </w:r>

</xml_diff>